<commit_message>
updated DCDATN , add weekly excel report
</commit_message>
<xml_diff>
--- a/docs/DCDATN_25410104_NguyenMinhNhat_25410034_LeQuangHoaiDuc.docx
+++ b/docs/DCDATN_25410104_NguyenMinhNhat_25410034_LeQuangHoaiDuc.docx
@@ -1744,7 +1744,37 @@
               <w:spacing w:line="252" w:lineRule="auto"/>
             </w:pPr>
             <w:r>
-              <w:t>Cả hai cùng tải bộ dữ liệu công khai và tự chụp ảnh bãi xe ở nhiều điều kiện ánh sáng; chia nhau gắn nhãn và chia tập train/val/test. Viết phần báo cáo tương ứng.</w:t>
+              <w:t>Cả hai cùng research và tải các bộ dữ liệu công khai về biển số/phương tiện tại bãi xe, đánh giá mức độ đáp ứng về điều kiện ánh sáng và bối cản</w:t>
+            </w:r>
+            <w:r>
+              <w:t>h</w:t>
+            </w:r>
+            <w:r>
+              <w:t xml:space="preserve">. </w:t>
+            </w:r>
+            <w:r>
+              <w:rPr>
+                <w:i/>
+                <w:iCs/>
+              </w:rPr>
+              <w:t xml:space="preserve">Chỉ tự chụp bổ sung nếu dữ liệu công khai chưa đủ, và cần lưu ý vấn đề </w:t>
+            </w:r>
+            <w:r>
+              <w:rPr>
+                <w:i/>
+                <w:iCs/>
+              </w:rPr>
+              <w:t>quyền riêng tư</w:t>
+            </w:r>
+            <w:r>
+              <w:rPr>
+                <w:i/>
+                <w:iCs/>
+              </w:rPr>
+              <w:t xml:space="preserve"> khi đó</w:t>
+            </w:r>
+            <w:r>
+              <w:t>. Chia nhau gắn nhãn và chia tập train/val/test. Viết phần báo cáo tương ứng.</w:t>
             </w:r>
           </w:p>
         </w:tc>
@@ -2002,6 +2032,7 @@
                 <w:b/>
                 <w:bCs/>
               </w:rPr>
+              <w:lastRenderedPageBreak/>
               <w:t>Tuần 4</w:t>
             </w:r>
           </w:p>
@@ -2082,6 +2113,663 @@
             </w:r>
             <w:r>
               <w:br/>
+              <w:t>Viết phần báo cáo tương ứng.</w:t>
+            </w:r>
+          </w:p>
+        </w:tc>
+        <w:tc>
+          <w:tcPr>
+            <w:tcW w:w="1240" w:type="dxa"/>
+            <w:tcBorders>
+              <w:top w:val="single" w:sz="4" w:space="0" w:color="000000"/>
+              <w:left w:val="single" w:sz="4" w:space="0" w:color="000000"/>
+              <w:bottom w:val="single" w:sz="4" w:space="0" w:color="000000"/>
+              <w:right w:val="single" w:sz="4" w:space="0" w:color="000000"/>
+            </w:tcBorders>
+            <w:tcMar>
+              <w:top w:w="60" w:type="dxa"/>
+              <w:left w:w="80" w:type="dxa"/>
+              <w:bottom w:w="60" w:type="dxa"/>
+              <w:right w:w="80" w:type="dxa"/>
+            </w:tcMar>
+            <w:vAlign w:val="center"/>
+          </w:tcPr>
+          <w:p>
+            <w:pPr>
+              <w:spacing w:line="252" w:lineRule="auto"/>
+              <w:jc w:val="center"/>
+            </w:pPr>
+            <w:r>
+              <w:t>Cả 2</w:t>
+            </w:r>
+          </w:p>
+        </w:tc>
+        <w:tc>
+          <w:tcPr>
+            <w:tcW w:w="2000" w:type="dxa"/>
+            <w:tcBorders>
+              <w:top w:val="single" w:sz="4" w:space="0" w:color="000000"/>
+              <w:left w:val="single" w:sz="4" w:space="0" w:color="000000"/>
+              <w:bottom w:val="single" w:sz="4" w:space="0" w:color="000000"/>
+              <w:right w:val="single" w:sz="4" w:space="0" w:color="000000"/>
+            </w:tcBorders>
+            <w:tcMar>
+              <w:top w:w="60" w:type="dxa"/>
+              <w:left w:w="80" w:type="dxa"/>
+              <w:bottom w:w="60" w:type="dxa"/>
+              <w:right w:w="80" w:type="dxa"/>
+            </w:tcMar>
+            <w:vAlign w:val="center"/>
+          </w:tcPr>
+          <w:p>
+            <w:pPr>
+              <w:spacing w:line="252" w:lineRule="auto"/>
+            </w:pPr>
+            <w:r>
+              <w:t>Đọc được chuỗi biển số; khung CSDL và logic vào/ra hoạt động.</w:t>
+            </w:r>
+          </w:p>
+        </w:tc>
+      </w:tr>
+      <w:tr>
+        <w:tc>
+          <w:tcPr>
+            <w:tcW w:w="1100" w:type="dxa"/>
+            <w:tcBorders>
+              <w:top w:val="single" w:sz="4" w:space="0" w:color="000000"/>
+              <w:left w:val="single" w:sz="4" w:space="0" w:color="000000"/>
+              <w:bottom w:val="single" w:sz="4" w:space="0" w:color="000000"/>
+              <w:right w:val="single" w:sz="4" w:space="0" w:color="000000"/>
+            </w:tcBorders>
+            <w:tcMar>
+              <w:top w:w="60" w:type="dxa"/>
+              <w:left w:w="40" w:type="dxa"/>
+              <w:bottom w:w="60" w:type="dxa"/>
+              <w:right w:w="40" w:type="dxa"/>
+            </w:tcMar>
+            <w:vAlign w:val="center"/>
+          </w:tcPr>
+          <w:p>
+            <w:pPr>
+              <w:spacing w:line="240" w:lineRule="auto"/>
+              <w:jc w:val="center"/>
+            </w:pPr>
+            <w:r>
+              <w:rPr>
+                <w:b/>
+                <w:bCs/>
+              </w:rPr>
+              <w:t>Tuần 5</w:t>
+            </w:r>
+          </w:p>
+          <w:p>
+            <w:pPr>
+              <w:spacing w:line="240" w:lineRule="auto"/>
+              <w:jc w:val="center"/>
+            </w:pPr>
+            <w:r>
+              <w:rPr>
+                <w:sz w:val="22"/>
+                <w:szCs w:val="22"/>
+              </w:rPr>
+              <w:t>12/08 - 19/08</w:t>
+            </w:r>
+          </w:p>
+        </w:tc>
+        <w:tc>
+          <w:tcPr>
+            <w:tcW w:w="1500" w:type="dxa"/>
+            <w:tcBorders>
+              <w:top w:val="single" w:sz="4" w:space="0" w:color="000000"/>
+              <w:left w:val="single" w:sz="4" w:space="0" w:color="000000"/>
+              <w:bottom w:val="single" w:sz="4" w:space="0" w:color="000000"/>
+              <w:right w:val="single" w:sz="4" w:space="0" w:color="000000"/>
+            </w:tcBorders>
+            <w:tcMar>
+              <w:top w:w="60" w:type="dxa"/>
+              <w:left w:w="80" w:type="dxa"/>
+              <w:bottom w:w="60" w:type="dxa"/>
+              <w:right w:w="80" w:type="dxa"/>
+            </w:tcMar>
+            <w:vAlign w:val="center"/>
+          </w:tcPr>
+          <w:p>
+            <w:pPr>
+              <w:spacing w:line="252" w:lineRule="auto"/>
+            </w:pPr>
+            <w:r>
+              <w:t>Song song: Phân loại &amp; Dashboard</w:t>
+            </w:r>
+          </w:p>
+        </w:tc>
+        <w:tc>
+          <w:tcPr>
+            <w:tcW w:w="3180" w:type="dxa"/>
+            <w:tcBorders>
+              <w:top w:val="single" w:sz="4" w:space="0" w:color="000000"/>
+              <w:left w:val="single" w:sz="4" w:space="0" w:color="000000"/>
+              <w:bottom w:val="single" w:sz="4" w:space="0" w:color="000000"/>
+              <w:right w:val="single" w:sz="4" w:space="0" w:color="000000"/>
+            </w:tcBorders>
+            <w:tcMar>
+              <w:top w:w="60" w:type="dxa"/>
+              <w:left w:w="80" w:type="dxa"/>
+              <w:bottom w:w="60" w:type="dxa"/>
+              <w:right w:w="80" w:type="dxa"/>
+            </w:tcMar>
+            <w:vAlign w:val="center"/>
+          </w:tcPr>
+          <w:p>
+            <w:pPr>
+              <w:spacing w:line="252" w:lineRule="auto"/>
+            </w:pPr>
+            <w:r>
+              <w:rPr>
+                <w:b/>
+                <w:bCs/>
+              </w:rPr>
+              <w:t>Nhật</w:t>
+            </w:r>
+            <w:r>
+              <w:t xml:space="preserve">: huấn luyện mô hình phân loại loại xe, so sánh ResNet/MobileNet, đánh giá F1. </w:t>
+            </w:r>
+            <w:r>
+              <w:br/>
+            </w:r>
+            <w:r>
+              <w:rPr>
+                <w:b/>
+                <w:bCs/>
+              </w:rPr>
+              <w:t>Đức</w:t>
+            </w:r>
+            <w:r>
+              <w:t xml:space="preserve">: xây dựng dashboard quản lý và thống kê (loại xe, màu biển, lưu lượng, doanh thu). </w:t>
+            </w:r>
+            <w:r>
+              <w:br/>
+              <w:t>Viết phần báo cáo tương ứng.</w:t>
+            </w:r>
+          </w:p>
+        </w:tc>
+        <w:tc>
+          <w:tcPr>
+            <w:tcW w:w="1240" w:type="dxa"/>
+            <w:tcBorders>
+              <w:top w:val="single" w:sz="4" w:space="0" w:color="000000"/>
+              <w:left w:val="single" w:sz="4" w:space="0" w:color="000000"/>
+              <w:bottom w:val="single" w:sz="4" w:space="0" w:color="000000"/>
+              <w:right w:val="single" w:sz="4" w:space="0" w:color="000000"/>
+            </w:tcBorders>
+            <w:tcMar>
+              <w:top w:w="60" w:type="dxa"/>
+              <w:left w:w="80" w:type="dxa"/>
+              <w:bottom w:w="60" w:type="dxa"/>
+              <w:right w:w="80" w:type="dxa"/>
+            </w:tcMar>
+            <w:vAlign w:val="center"/>
+          </w:tcPr>
+          <w:p>
+            <w:pPr>
+              <w:spacing w:line="252" w:lineRule="auto"/>
+              <w:jc w:val="center"/>
+            </w:pPr>
+            <w:r>
+              <w:t>Cả 2</w:t>
+            </w:r>
+          </w:p>
+        </w:tc>
+        <w:tc>
+          <w:tcPr>
+            <w:tcW w:w="2000" w:type="dxa"/>
+            <w:tcBorders>
+              <w:top w:val="single" w:sz="4" w:space="0" w:color="000000"/>
+              <w:left w:val="single" w:sz="4" w:space="0" w:color="000000"/>
+              <w:bottom w:val="single" w:sz="4" w:space="0" w:color="000000"/>
+              <w:right w:val="single" w:sz="4" w:space="0" w:color="000000"/>
+            </w:tcBorders>
+            <w:tcMar>
+              <w:top w:w="60" w:type="dxa"/>
+              <w:left w:w="80" w:type="dxa"/>
+              <w:bottom w:w="60" w:type="dxa"/>
+              <w:right w:w="80" w:type="dxa"/>
+            </w:tcMar>
+            <w:vAlign w:val="center"/>
+          </w:tcPr>
+          <w:p>
+            <w:pPr>
+              <w:spacing w:line="252" w:lineRule="auto"/>
+            </w:pPr>
+            <w:r>
+              <w:t>Mô hình phân loại loại xe kèm số liệu; dashboard thống kê hoạt động.</w:t>
+            </w:r>
+          </w:p>
+        </w:tc>
+      </w:tr>
+      <w:tr>
+        <w:tc>
+          <w:tcPr>
+            <w:tcW w:w="1100" w:type="dxa"/>
+            <w:tcBorders>
+              <w:top w:val="single" w:sz="4" w:space="0" w:color="000000"/>
+              <w:left w:val="single" w:sz="4" w:space="0" w:color="000000"/>
+              <w:bottom w:val="single" w:sz="4" w:space="0" w:color="000000"/>
+              <w:right w:val="single" w:sz="4" w:space="0" w:color="000000"/>
+            </w:tcBorders>
+            <w:tcMar>
+              <w:top w:w="60" w:type="dxa"/>
+              <w:left w:w="40" w:type="dxa"/>
+              <w:bottom w:w="60" w:type="dxa"/>
+              <w:right w:w="40" w:type="dxa"/>
+            </w:tcMar>
+            <w:vAlign w:val="center"/>
+          </w:tcPr>
+          <w:p>
+            <w:pPr>
+              <w:spacing w:line="240" w:lineRule="auto"/>
+              <w:jc w:val="center"/>
+            </w:pPr>
+            <w:r>
+              <w:rPr>
+                <w:b/>
+                <w:bCs/>
+              </w:rPr>
+              <w:t>Tuần 6</w:t>
+            </w:r>
+          </w:p>
+          <w:p>
+            <w:pPr>
+              <w:spacing w:line="240" w:lineRule="auto"/>
+              <w:jc w:val="center"/>
+            </w:pPr>
+            <w:r>
+              <w:rPr>
+                <w:sz w:val="22"/>
+                <w:szCs w:val="22"/>
+              </w:rPr>
+              <w:t>19/08 - 26/08</w:t>
+            </w:r>
+          </w:p>
+        </w:tc>
+        <w:tc>
+          <w:tcPr>
+            <w:tcW w:w="1500" w:type="dxa"/>
+            <w:tcBorders>
+              <w:top w:val="single" w:sz="4" w:space="0" w:color="000000"/>
+              <w:left w:val="single" w:sz="4" w:space="0" w:color="000000"/>
+              <w:bottom w:val="single" w:sz="4" w:space="0" w:color="000000"/>
+              <w:right w:val="single" w:sz="4" w:space="0" w:color="000000"/>
+            </w:tcBorders>
+            <w:tcMar>
+              <w:top w:w="60" w:type="dxa"/>
+              <w:left w:w="80" w:type="dxa"/>
+              <w:bottom w:w="60" w:type="dxa"/>
+              <w:right w:w="80" w:type="dxa"/>
+            </w:tcMar>
+            <w:vAlign w:val="center"/>
+          </w:tcPr>
+          <w:p>
+            <w:pPr>
+              <w:spacing w:line="252" w:lineRule="auto"/>
+            </w:pPr>
+            <w:r>
+              <w:t>Tích hợp hệ thống</w:t>
+            </w:r>
+          </w:p>
+        </w:tc>
+        <w:tc>
+          <w:tcPr>
+            <w:tcW w:w="3180" w:type="dxa"/>
+            <w:tcBorders>
+              <w:top w:val="single" w:sz="4" w:space="0" w:color="000000"/>
+              <w:left w:val="single" w:sz="4" w:space="0" w:color="000000"/>
+              <w:bottom w:val="single" w:sz="4" w:space="0" w:color="000000"/>
+              <w:right w:val="single" w:sz="4" w:space="0" w:color="000000"/>
+            </w:tcBorders>
+            <w:tcMar>
+              <w:top w:w="60" w:type="dxa"/>
+              <w:left w:w="80" w:type="dxa"/>
+              <w:bottom w:w="60" w:type="dxa"/>
+              <w:right w:w="80" w:type="dxa"/>
+            </w:tcMar>
+            <w:vAlign w:val="center"/>
+          </w:tcPr>
+          <w:p>
+            <w:pPr>
+              <w:spacing w:line="252" w:lineRule="auto"/>
+            </w:pPr>
+            <w:r>
+              <w:t xml:space="preserve">Gộp các mô hình (phát hiện, OCR, phân loại) và module màu biển thành một luồng nhận diện thống nhất; kết nối với CSDL và dashboard; hoàn thiện luồng xử lý end-to-end. </w:t>
+            </w:r>
+            <w:r>
+              <w:br/>
+              <w:t>Viết phần báo cáo tương ứng.</w:t>
+            </w:r>
+          </w:p>
+        </w:tc>
+        <w:tc>
+          <w:tcPr>
+            <w:tcW w:w="1240" w:type="dxa"/>
+            <w:tcBorders>
+              <w:top w:val="single" w:sz="4" w:space="0" w:color="000000"/>
+              <w:left w:val="single" w:sz="4" w:space="0" w:color="000000"/>
+              <w:bottom w:val="single" w:sz="4" w:space="0" w:color="000000"/>
+              <w:right w:val="single" w:sz="4" w:space="0" w:color="000000"/>
+            </w:tcBorders>
+            <w:tcMar>
+              <w:top w:w="60" w:type="dxa"/>
+              <w:left w:w="80" w:type="dxa"/>
+              <w:bottom w:w="60" w:type="dxa"/>
+              <w:right w:w="80" w:type="dxa"/>
+            </w:tcMar>
+            <w:vAlign w:val="center"/>
+          </w:tcPr>
+          <w:p>
+            <w:pPr>
+              <w:spacing w:line="252" w:lineRule="auto"/>
+              <w:jc w:val="center"/>
+            </w:pPr>
+            <w:r>
+              <w:t>Cả 2</w:t>
+            </w:r>
+          </w:p>
+        </w:tc>
+        <w:tc>
+          <w:tcPr>
+            <w:tcW w:w="2000" w:type="dxa"/>
+            <w:tcBorders>
+              <w:top w:val="single" w:sz="4" w:space="0" w:color="000000"/>
+              <w:left w:val="single" w:sz="4" w:space="0" w:color="000000"/>
+              <w:bottom w:val="single" w:sz="4" w:space="0" w:color="000000"/>
+              <w:right w:val="single" w:sz="4" w:space="0" w:color="000000"/>
+            </w:tcBorders>
+            <w:tcMar>
+              <w:top w:w="60" w:type="dxa"/>
+              <w:left w:w="80" w:type="dxa"/>
+              <w:bottom w:w="60" w:type="dxa"/>
+              <w:right w:w="80" w:type="dxa"/>
+            </w:tcMar>
+            <w:vAlign w:val="center"/>
+          </w:tcPr>
+          <w:p>
+            <w:pPr>
+              <w:spacing w:line="252" w:lineRule="auto"/>
+            </w:pPr>
+            <w:r>
+              <w:t>Hệ thống chạy end-to-end trên PC: mỗi xe cho ra biển số, loại xe, màu biển và được ghi nhận.</w:t>
+            </w:r>
+          </w:p>
+        </w:tc>
+      </w:tr>
+      <w:tr>
+        <w:tc>
+          <w:tcPr>
+            <w:tcW w:w="1100" w:type="dxa"/>
+            <w:tcBorders>
+              <w:top w:val="single" w:sz="4" w:space="0" w:color="000000"/>
+              <w:left w:val="single" w:sz="4" w:space="0" w:color="000000"/>
+              <w:bottom w:val="single" w:sz="4" w:space="0" w:color="000000"/>
+              <w:right w:val="single" w:sz="4" w:space="0" w:color="000000"/>
+            </w:tcBorders>
+            <w:tcMar>
+              <w:top w:w="60" w:type="dxa"/>
+              <w:left w:w="40" w:type="dxa"/>
+              <w:bottom w:w="60" w:type="dxa"/>
+              <w:right w:w="40" w:type="dxa"/>
+            </w:tcMar>
+            <w:vAlign w:val="center"/>
+          </w:tcPr>
+          <w:p>
+            <w:pPr>
+              <w:spacing w:line="240" w:lineRule="auto"/>
+              <w:jc w:val="center"/>
+            </w:pPr>
+            <w:r>
+              <w:rPr>
+                <w:b/>
+                <w:bCs/>
+              </w:rPr>
+              <w:t>Tuần 7</w:t>
+            </w:r>
+          </w:p>
+          <w:p>
+            <w:pPr>
+              <w:spacing w:line="240" w:lineRule="auto"/>
+              <w:jc w:val="center"/>
+            </w:pPr>
+            <w:r>
+              <w:rPr>
+                <w:sz w:val="22"/>
+                <w:szCs w:val="22"/>
+              </w:rPr>
+              <w:t>26/08 - 02/09</w:t>
+            </w:r>
+          </w:p>
+        </w:tc>
+        <w:tc>
+          <w:tcPr>
+            <w:tcW w:w="1500" w:type="dxa"/>
+            <w:tcBorders>
+              <w:top w:val="single" w:sz="4" w:space="0" w:color="000000"/>
+              <w:left w:val="single" w:sz="4" w:space="0" w:color="000000"/>
+              <w:bottom w:val="single" w:sz="4" w:space="0" w:color="000000"/>
+              <w:right w:val="single" w:sz="4" w:space="0" w:color="000000"/>
+            </w:tcBorders>
+            <w:tcMar>
+              <w:top w:w="60" w:type="dxa"/>
+              <w:left w:w="80" w:type="dxa"/>
+              <w:bottom w:w="60" w:type="dxa"/>
+              <w:right w:w="80" w:type="dxa"/>
+            </w:tcMar>
+            <w:vAlign w:val="center"/>
+          </w:tcPr>
+          <w:p>
+            <w:pPr>
+              <w:spacing w:line="252" w:lineRule="auto"/>
+            </w:pPr>
+            <w:r>
+              <w:t>Song song: Tối ưu mô hình &amp; Chuẩn bị biên</w:t>
+            </w:r>
+          </w:p>
+        </w:tc>
+        <w:tc>
+          <w:tcPr>
+            <w:tcW w:w="3180" w:type="dxa"/>
+            <w:tcBorders>
+              <w:top w:val="single" w:sz="4" w:space="0" w:color="000000"/>
+              <w:left w:val="single" w:sz="4" w:space="0" w:color="000000"/>
+              <w:bottom w:val="single" w:sz="4" w:space="0" w:color="000000"/>
+              <w:right w:val="single" w:sz="4" w:space="0" w:color="000000"/>
+            </w:tcBorders>
+            <w:tcMar>
+              <w:top w:w="60" w:type="dxa"/>
+              <w:left w:w="80" w:type="dxa"/>
+              <w:bottom w:w="60" w:type="dxa"/>
+              <w:right w:w="80" w:type="dxa"/>
+            </w:tcMar>
+            <w:vAlign w:val="center"/>
+          </w:tcPr>
+          <w:p>
+            <w:pPr>
+              <w:spacing w:line="252" w:lineRule="auto"/>
+            </w:pPr>
+            <w:r>
+              <w:rPr>
+                <w:b/>
+                <w:bCs/>
+              </w:rPr>
+              <w:t>Nhật</w:t>
+            </w:r>
+            <w:r>
+              <w:t xml:space="preserve">: tối ưu và đóng gói mô hình (ONNX, quantization) theo hướng khả chuyển. </w:t>
+            </w:r>
+            <w:r>
+              <w:rPr>
+                <w:b/>
+                <w:bCs/>
+              </w:rPr>
+              <w:t>Đức</w:t>
+            </w:r>
+            <w:r>
+              <w:t xml:space="preserve">: cài đặt, cấu hình thiết bị biên và đóng gói hệ thống để triển khai. </w:t>
+            </w:r>
+            <w:r>
+              <w:br/>
+              <w:t>Viết phần báo cáo tương ứng.</w:t>
+            </w:r>
+          </w:p>
+        </w:tc>
+        <w:tc>
+          <w:tcPr>
+            <w:tcW w:w="1240" w:type="dxa"/>
+            <w:tcBorders>
+              <w:top w:val="single" w:sz="4" w:space="0" w:color="000000"/>
+              <w:left w:val="single" w:sz="4" w:space="0" w:color="000000"/>
+              <w:bottom w:val="single" w:sz="4" w:space="0" w:color="000000"/>
+              <w:right w:val="single" w:sz="4" w:space="0" w:color="000000"/>
+            </w:tcBorders>
+            <w:tcMar>
+              <w:top w:w="60" w:type="dxa"/>
+              <w:left w:w="80" w:type="dxa"/>
+              <w:bottom w:w="60" w:type="dxa"/>
+              <w:right w:w="80" w:type="dxa"/>
+            </w:tcMar>
+            <w:vAlign w:val="center"/>
+          </w:tcPr>
+          <w:p>
+            <w:pPr>
+              <w:spacing w:line="252" w:lineRule="auto"/>
+              <w:jc w:val="center"/>
+            </w:pPr>
+            <w:r>
+              <w:t>Cả 2</w:t>
+            </w:r>
+          </w:p>
+        </w:tc>
+        <w:tc>
+          <w:tcPr>
+            <w:tcW w:w="2000" w:type="dxa"/>
+            <w:tcBorders>
+              <w:top w:val="single" w:sz="4" w:space="0" w:color="000000"/>
+              <w:left w:val="single" w:sz="4" w:space="0" w:color="000000"/>
+              <w:bottom w:val="single" w:sz="4" w:space="0" w:color="000000"/>
+              <w:right w:val="single" w:sz="4" w:space="0" w:color="000000"/>
+            </w:tcBorders>
+            <w:tcMar>
+              <w:top w:w="60" w:type="dxa"/>
+              <w:left w:w="80" w:type="dxa"/>
+              <w:bottom w:w="60" w:type="dxa"/>
+              <w:right w:w="80" w:type="dxa"/>
+            </w:tcMar>
+            <w:vAlign w:val="center"/>
+          </w:tcPr>
+          <w:p>
+            <w:pPr>
+              <w:spacing w:line="252" w:lineRule="auto"/>
+            </w:pPr>
+            <w:r>
+              <w:t>Mô hình đã tối ưu, khả chuyển; thiết bị biên sẵn sàng.</w:t>
+            </w:r>
+          </w:p>
+        </w:tc>
+      </w:tr>
+      <w:tr>
+        <w:tc>
+          <w:tcPr>
+            <w:tcW w:w="1100" w:type="dxa"/>
+            <w:tcBorders>
+              <w:top w:val="single" w:sz="4" w:space="0" w:color="000000"/>
+              <w:left w:val="single" w:sz="4" w:space="0" w:color="000000"/>
+              <w:bottom w:val="single" w:sz="4" w:space="0" w:color="000000"/>
+              <w:right w:val="single" w:sz="4" w:space="0" w:color="000000"/>
+            </w:tcBorders>
+            <w:tcMar>
+              <w:top w:w="60" w:type="dxa"/>
+              <w:left w:w="40" w:type="dxa"/>
+              <w:bottom w:w="60" w:type="dxa"/>
+              <w:right w:w="40" w:type="dxa"/>
+            </w:tcMar>
+            <w:vAlign w:val="center"/>
+          </w:tcPr>
+          <w:p>
+            <w:pPr>
+              <w:spacing w:line="240" w:lineRule="auto"/>
+              <w:jc w:val="center"/>
+            </w:pPr>
+            <w:r>
+              <w:rPr>
+                <w:b/>
+                <w:bCs/>
+              </w:rPr>
+              <w:t>Tuần 8</w:t>
+            </w:r>
+          </w:p>
+          <w:p>
+            <w:pPr>
+              <w:spacing w:line="240" w:lineRule="auto"/>
+              <w:jc w:val="center"/>
+            </w:pPr>
+            <w:r>
+              <w:rPr>
+                <w:sz w:val="22"/>
+                <w:szCs w:val="22"/>
+              </w:rPr>
+              <w:t>02/09 - 09/09</w:t>
+            </w:r>
+          </w:p>
+        </w:tc>
+        <w:tc>
+          <w:tcPr>
+            <w:tcW w:w="1500" w:type="dxa"/>
+            <w:tcBorders>
+              <w:top w:val="single" w:sz="4" w:space="0" w:color="000000"/>
+              <w:left w:val="single" w:sz="4" w:space="0" w:color="000000"/>
+              <w:bottom w:val="single" w:sz="4" w:space="0" w:color="000000"/>
+              <w:right w:val="single" w:sz="4" w:space="0" w:color="000000"/>
+            </w:tcBorders>
+            <w:tcMar>
+              <w:top w:w="60" w:type="dxa"/>
+              <w:left w:w="80" w:type="dxa"/>
+              <w:bottom w:w="60" w:type="dxa"/>
+              <w:right w:w="80" w:type="dxa"/>
+            </w:tcMar>
+            <w:vAlign w:val="center"/>
+          </w:tcPr>
+          <w:p>
+            <w:pPr>
+              <w:spacing w:line="252" w:lineRule="auto"/>
+            </w:pPr>
+            <w:r>
+              <w:t>Triển khai thiết bị biên</w:t>
+            </w:r>
+          </w:p>
+        </w:tc>
+        <w:tc>
+          <w:tcPr>
+            <w:tcW w:w="3180" w:type="dxa"/>
+            <w:tcBorders>
+              <w:top w:val="single" w:sz="4" w:space="0" w:color="000000"/>
+              <w:left w:val="single" w:sz="4" w:space="0" w:color="000000"/>
+              <w:bottom w:val="single" w:sz="4" w:space="0" w:color="000000"/>
+              <w:right w:val="single" w:sz="4" w:space="0" w:color="000000"/>
+            </w:tcBorders>
+            <w:tcMar>
+              <w:top w:w="60" w:type="dxa"/>
+              <w:left w:w="80" w:type="dxa"/>
+              <w:bottom w:w="60" w:type="dxa"/>
+              <w:right w:w="80" w:type="dxa"/>
+            </w:tcMar>
+            <w:vAlign w:val="center"/>
+          </w:tcPr>
+          <w:p>
+            <w:pPr>
+              <w:spacing w:line="252" w:lineRule="auto"/>
+            </w:pPr>
+            <w:r>
+              <w:t xml:space="preserve">Triển khai toàn hệ thống lên thiết bị biên; chạy thử theo cơ chế xử lý từng lượt xe; sửa lỗi tích hợp. </w:t>
+            </w:r>
+            <w:r>
+              <w:br/>
             </w:r>
             <w:r>
               <w:lastRenderedPageBreak/>
@@ -2139,7 +2827,7 @@
               <w:spacing w:line="252" w:lineRule="auto"/>
             </w:pPr>
             <w:r>
-              <w:t>Đọc được chuỗi biển số; khung CSDL và logic vào/ra hoạt động.</w:t>
+              <w:t>Hệ thống chạy được trên thiết bị biên.</w:t>
             </w:r>
           </w:p>
         </w:tc>
@@ -2172,7 +2860,7 @@
                 <w:b/>
                 <w:bCs/>
               </w:rPr>
-              <w:t>Tuần 5</w:t>
+              <w:t>Tuần 9</w:t>
             </w:r>
           </w:p>
           <w:p>
@@ -2185,7 +2873,7 @@
                 <w:sz w:val="22"/>
                 <w:szCs w:val="22"/>
               </w:rPr>
-              <w:t>12/08 - 19/08</w:t>
+              <w:t>09/09 - 16/09</w:t>
             </w:r>
           </w:p>
         </w:tc>
@@ -2211,7 +2899,7 @@
               <w:spacing w:line="252" w:lineRule="auto"/>
             </w:pPr>
             <w:r>
-              <w:t>Song song: Phân loại &amp; Dashboard</w:t>
+              <w:t>Kiểm thử &amp; Đánh giá đa nền tảng</w:t>
             </w:r>
           </w:p>
         </w:tc>
@@ -2235,765 +2923,98 @@
           <w:p>
             <w:pPr>
               <w:spacing w:line="252" w:lineRule="auto"/>
+            </w:pPr>
+            <w:r>
+              <w:t xml:space="preserve">Đo mAP, độ chính xác đọc biển, F1 loại xe, độ chính xác màu và tốc độ (PC so với thiết bị biên) theo từng điều kiện ánh sáng; sửa lỗi và tối ưu. </w:t>
+            </w:r>
+            <w:r>
+              <w:br/>
+              <w:t>Viết phần báo cáo tương ứng.</w:t>
+            </w:r>
+          </w:p>
+        </w:tc>
+        <w:tc>
+          <w:tcPr>
+            <w:tcW w:w="1240" w:type="dxa"/>
+            <w:tcBorders>
+              <w:top w:val="single" w:sz="4" w:space="0" w:color="000000"/>
+              <w:left w:val="single" w:sz="4" w:space="0" w:color="000000"/>
+              <w:bottom w:val="single" w:sz="4" w:space="0" w:color="000000"/>
+              <w:right w:val="single" w:sz="4" w:space="0" w:color="000000"/>
+            </w:tcBorders>
+            <w:tcMar>
+              <w:top w:w="60" w:type="dxa"/>
+              <w:left w:w="80" w:type="dxa"/>
+              <w:bottom w:w="60" w:type="dxa"/>
+              <w:right w:w="80" w:type="dxa"/>
+            </w:tcMar>
+            <w:vAlign w:val="center"/>
+          </w:tcPr>
+          <w:p>
+            <w:pPr>
+              <w:spacing w:line="252" w:lineRule="auto"/>
+              <w:jc w:val="center"/>
+            </w:pPr>
+            <w:r>
+              <w:t>Cả 2</w:t>
+            </w:r>
+          </w:p>
+        </w:tc>
+        <w:tc>
+          <w:tcPr>
+            <w:tcW w:w="2000" w:type="dxa"/>
+            <w:tcBorders>
+              <w:top w:val="single" w:sz="4" w:space="0" w:color="000000"/>
+              <w:left w:val="single" w:sz="4" w:space="0" w:color="000000"/>
+              <w:bottom w:val="single" w:sz="4" w:space="0" w:color="000000"/>
+              <w:right w:val="single" w:sz="4" w:space="0" w:color="000000"/>
+            </w:tcBorders>
+            <w:tcMar>
+              <w:top w:w="60" w:type="dxa"/>
+              <w:left w:w="80" w:type="dxa"/>
+              <w:bottom w:w="60" w:type="dxa"/>
+              <w:right w:w="80" w:type="dxa"/>
+            </w:tcMar>
+            <w:vAlign w:val="center"/>
+          </w:tcPr>
+          <w:p>
+            <w:pPr>
+              <w:spacing w:line="252" w:lineRule="auto"/>
+            </w:pPr>
+            <w:r>
+              <w:t>Bảng số liệu đánh giá đầy đủ; bảng so sánh hiệu năng đa nền tảng.</w:t>
+            </w:r>
+          </w:p>
+        </w:tc>
+      </w:tr>
+      <w:tr>
+        <w:tc>
+          <w:tcPr>
+            <w:tcW w:w="1100" w:type="dxa"/>
+            <w:tcBorders>
+              <w:top w:val="single" w:sz="4" w:space="0" w:color="000000"/>
+              <w:left w:val="single" w:sz="4" w:space="0" w:color="000000"/>
+              <w:bottom w:val="single" w:sz="4" w:space="0" w:color="000000"/>
+              <w:right w:val="single" w:sz="4" w:space="0" w:color="000000"/>
+            </w:tcBorders>
+            <w:tcMar>
+              <w:top w:w="60" w:type="dxa"/>
+              <w:left w:w="40" w:type="dxa"/>
+              <w:bottom w:w="60" w:type="dxa"/>
+              <w:right w:w="40" w:type="dxa"/>
+            </w:tcMar>
+            <w:vAlign w:val="center"/>
+          </w:tcPr>
+          <w:p>
+            <w:pPr>
+              <w:spacing w:line="240" w:lineRule="auto"/>
+              <w:jc w:val="center"/>
             </w:pPr>
             <w:r>
               <w:rPr>
                 <w:b/>
                 <w:bCs/>
               </w:rPr>
-              <w:t>Nhật</w:t>
-            </w:r>
-            <w:r>
-              <w:t xml:space="preserve">: huấn luyện mô hình phân loại loại xe, so sánh ResNet/MobileNet, đánh giá F1. </w:t>
-            </w:r>
-            <w:r>
-              <w:br/>
-            </w:r>
-            <w:r>
-              <w:rPr>
-                <w:b/>
-                <w:bCs/>
-              </w:rPr>
-              <w:t>Đức</w:t>
-            </w:r>
-            <w:r>
-              <w:t xml:space="preserve">: xây dựng dashboard quản lý và thống kê (loại xe, màu biển, lưu lượng, doanh thu). </w:t>
-            </w:r>
-            <w:r>
-              <w:br/>
-              <w:t>Viết phần báo cáo tương ứng.</w:t>
-            </w:r>
-          </w:p>
-        </w:tc>
-        <w:tc>
-          <w:tcPr>
-            <w:tcW w:w="1240" w:type="dxa"/>
-            <w:tcBorders>
-              <w:top w:val="single" w:sz="4" w:space="0" w:color="000000"/>
-              <w:left w:val="single" w:sz="4" w:space="0" w:color="000000"/>
-              <w:bottom w:val="single" w:sz="4" w:space="0" w:color="000000"/>
-              <w:right w:val="single" w:sz="4" w:space="0" w:color="000000"/>
-            </w:tcBorders>
-            <w:tcMar>
-              <w:top w:w="60" w:type="dxa"/>
-              <w:left w:w="80" w:type="dxa"/>
-              <w:bottom w:w="60" w:type="dxa"/>
-              <w:right w:w="80" w:type="dxa"/>
-            </w:tcMar>
-            <w:vAlign w:val="center"/>
-          </w:tcPr>
-          <w:p>
-            <w:pPr>
-              <w:spacing w:line="252" w:lineRule="auto"/>
-              <w:jc w:val="center"/>
-            </w:pPr>
-            <w:r>
-              <w:t>Cả 2</w:t>
-            </w:r>
-          </w:p>
-        </w:tc>
-        <w:tc>
-          <w:tcPr>
-            <w:tcW w:w="2000" w:type="dxa"/>
-            <w:tcBorders>
-              <w:top w:val="single" w:sz="4" w:space="0" w:color="000000"/>
-              <w:left w:val="single" w:sz="4" w:space="0" w:color="000000"/>
-              <w:bottom w:val="single" w:sz="4" w:space="0" w:color="000000"/>
-              <w:right w:val="single" w:sz="4" w:space="0" w:color="000000"/>
-            </w:tcBorders>
-            <w:tcMar>
-              <w:top w:w="60" w:type="dxa"/>
-              <w:left w:w="80" w:type="dxa"/>
-              <w:bottom w:w="60" w:type="dxa"/>
-              <w:right w:w="80" w:type="dxa"/>
-            </w:tcMar>
-            <w:vAlign w:val="center"/>
-          </w:tcPr>
-          <w:p>
-            <w:pPr>
-              <w:spacing w:line="252" w:lineRule="auto"/>
-            </w:pPr>
-            <w:r>
-              <w:t>Mô hình phân loại loại xe kèm số liệu; dashboard thống kê hoạt động.</w:t>
-            </w:r>
-          </w:p>
-        </w:tc>
-      </w:tr>
-      <w:tr>
-        <w:tc>
-          <w:tcPr>
-            <w:tcW w:w="1100" w:type="dxa"/>
-            <w:tcBorders>
-              <w:top w:val="single" w:sz="4" w:space="0" w:color="000000"/>
-              <w:left w:val="single" w:sz="4" w:space="0" w:color="000000"/>
-              <w:bottom w:val="single" w:sz="4" w:space="0" w:color="000000"/>
-              <w:right w:val="single" w:sz="4" w:space="0" w:color="000000"/>
-            </w:tcBorders>
-            <w:tcMar>
-              <w:top w:w="60" w:type="dxa"/>
-              <w:left w:w="40" w:type="dxa"/>
-              <w:bottom w:w="60" w:type="dxa"/>
-              <w:right w:w="40" w:type="dxa"/>
-            </w:tcMar>
-            <w:vAlign w:val="center"/>
-          </w:tcPr>
-          <w:p>
-            <w:pPr>
-              <w:spacing w:line="240" w:lineRule="auto"/>
-              <w:jc w:val="center"/>
-            </w:pPr>
-            <w:r>
-              <w:rPr>
-                <w:b/>
-                <w:bCs/>
-              </w:rPr>
-              <w:t>Tuần 6</w:t>
-            </w:r>
-          </w:p>
-          <w:p>
-            <w:pPr>
-              <w:spacing w:line="240" w:lineRule="auto"/>
-              <w:jc w:val="center"/>
-            </w:pPr>
-            <w:r>
-              <w:rPr>
-                <w:sz w:val="22"/>
-                <w:szCs w:val="22"/>
-              </w:rPr>
-              <w:t>19/08 - 26/08</w:t>
-            </w:r>
-          </w:p>
-        </w:tc>
-        <w:tc>
-          <w:tcPr>
-            <w:tcW w:w="1500" w:type="dxa"/>
-            <w:tcBorders>
-              <w:top w:val="single" w:sz="4" w:space="0" w:color="000000"/>
-              <w:left w:val="single" w:sz="4" w:space="0" w:color="000000"/>
-              <w:bottom w:val="single" w:sz="4" w:space="0" w:color="000000"/>
-              <w:right w:val="single" w:sz="4" w:space="0" w:color="000000"/>
-            </w:tcBorders>
-            <w:tcMar>
-              <w:top w:w="60" w:type="dxa"/>
-              <w:left w:w="80" w:type="dxa"/>
-              <w:bottom w:w="60" w:type="dxa"/>
-              <w:right w:w="80" w:type="dxa"/>
-            </w:tcMar>
-            <w:vAlign w:val="center"/>
-          </w:tcPr>
-          <w:p>
-            <w:pPr>
-              <w:spacing w:line="252" w:lineRule="auto"/>
-            </w:pPr>
-            <w:r>
-              <w:t>Tích hợp hệ thống</w:t>
-            </w:r>
-          </w:p>
-        </w:tc>
-        <w:tc>
-          <w:tcPr>
-            <w:tcW w:w="3180" w:type="dxa"/>
-            <w:tcBorders>
-              <w:top w:val="single" w:sz="4" w:space="0" w:color="000000"/>
-              <w:left w:val="single" w:sz="4" w:space="0" w:color="000000"/>
-              <w:bottom w:val="single" w:sz="4" w:space="0" w:color="000000"/>
-              <w:right w:val="single" w:sz="4" w:space="0" w:color="000000"/>
-            </w:tcBorders>
-            <w:tcMar>
-              <w:top w:w="60" w:type="dxa"/>
-              <w:left w:w="80" w:type="dxa"/>
-              <w:bottom w:w="60" w:type="dxa"/>
-              <w:right w:w="80" w:type="dxa"/>
-            </w:tcMar>
-            <w:vAlign w:val="center"/>
-          </w:tcPr>
-          <w:p>
-            <w:pPr>
-              <w:spacing w:line="252" w:lineRule="auto"/>
-            </w:pPr>
-            <w:r>
-              <w:t xml:space="preserve">Gộp các mô hình (phát hiện, OCR, phân loại) và module màu biển thành một luồng nhận diện thống nhất; kết nối với CSDL và dashboard; hoàn thiện luồng xử lý end-to-end. </w:t>
-            </w:r>
-            <w:r>
-              <w:br/>
-              <w:t>Viết phần báo cáo tương ứng.</w:t>
-            </w:r>
-          </w:p>
-        </w:tc>
-        <w:tc>
-          <w:tcPr>
-            <w:tcW w:w="1240" w:type="dxa"/>
-            <w:tcBorders>
-              <w:top w:val="single" w:sz="4" w:space="0" w:color="000000"/>
-              <w:left w:val="single" w:sz="4" w:space="0" w:color="000000"/>
-              <w:bottom w:val="single" w:sz="4" w:space="0" w:color="000000"/>
-              <w:right w:val="single" w:sz="4" w:space="0" w:color="000000"/>
-            </w:tcBorders>
-            <w:tcMar>
-              <w:top w:w="60" w:type="dxa"/>
-              <w:left w:w="80" w:type="dxa"/>
-              <w:bottom w:w="60" w:type="dxa"/>
-              <w:right w:w="80" w:type="dxa"/>
-            </w:tcMar>
-            <w:vAlign w:val="center"/>
-          </w:tcPr>
-          <w:p>
-            <w:pPr>
-              <w:spacing w:line="252" w:lineRule="auto"/>
-              <w:jc w:val="center"/>
-            </w:pPr>
-            <w:r>
-              <w:t>Cả 2</w:t>
-            </w:r>
-          </w:p>
-        </w:tc>
-        <w:tc>
-          <w:tcPr>
-            <w:tcW w:w="2000" w:type="dxa"/>
-            <w:tcBorders>
-              <w:top w:val="single" w:sz="4" w:space="0" w:color="000000"/>
-              <w:left w:val="single" w:sz="4" w:space="0" w:color="000000"/>
-              <w:bottom w:val="single" w:sz="4" w:space="0" w:color="000000"/>
-              <w:right w:val="single" w:sz="4" w:space="0" w:color="000000"/>
-            </w:tcBorders>
-            <w:tcMar>
-              <w:top w:w="60" w:type="dxa"/>
-              <w:left w:w="80" w:type="dxa"/>
-              <w:bottom w:w="60" w:type="dxa"/>
-              <w:right w:w="80" w:type="dxa"/>
-            </w:tcMar>
-            <w:vAlign w:val="center"/>
-          </w:tcPr>
-          <w:p>
-            <w:pPr>
-              <w:spacing w:line="252" w:lineRule="auto"/>
-            </w:pPr>
-            <w:r>
-              <w:t>Hệ thống chạy end-to-end trên PC: mỗi xe cho ra biển số, loại xe, màu biển và được ghi nhận.</w:t>
-            </w:r>
-          </w:p>
-        </w:tc>
-      </w:tr>
-      <w:tr>
-        <w:tc>
-          <w:tcPr>
-            <w:tcW w:w="1100" w:type="dxa"/>
-            <w:tcBorders>
-              <w:top w:val="single" w:sz="4" w:space="0" w:color="000000"/>
-              <w:left w:val="single" w:sz="4" w:space="0" w:color="000000"/>
-              <w:bottom w:val="single" w:sz="4" w:space="0" w:color="000000"/>
-              <w:right w:val="single" w:sz="4" w:space="0" w:color="000000"/>
-            </w:tcBorders>
-            <w:tcMar>
-              <w:top w:w="60" w:type="dxa"/>
-              <w:left w:w="40" w:type="dxa"/>
-              <w:bottom w:w="60" w:type="dxa"/>
-              <w:right w:w="40" w:type="dxa"/>
-            </w:tcMar>
-            <w:vAlign w:val="center"/>
-          </w:tcPr>
-          <w:p>
-            <w:pPr>
-              <w:spacing w:line="240" w:lineRule="auto"/>
-              <w:jc w:val="center"/>
-            </w:pPr>
-            <w:r>
-              <w:rPr>
-                <w:b/>
-                <w:bCs/>
-              </w:rPr>
-              <w:t>Tuần 7</w:t>
-            </w:r>
-          </w:p>
-          <w:p>
-            <w:pPr>
-              <w:spacing w:line="240" w:lineRule="auto"/>
-              <w:jc w:val="center"/>
-            </w:pPr>
-            <w:r>
-              <w:rPr>
-                <w:sz w:val="22"/>
-                <w:szCs w:val="22"/>
-              </w:rPr>
-              <w:t>26/08 - 02/09</w:t>
-            </w:r>
-          </w:p>
-        </w:tc>
-        <w:tc>
-          <w:tcPr>
-            <w:tcW w:w="1500" w:type="dxa"/>
-            <w:tcBorders>
-              <w:top w:val="single" w:sz="4" w:space="0" w:color="000000"/>
-              <w:left w:val="single" w:sz="4" w:space="0" w:color="000000"/>
-              <w:bottom w:val="single" w:sz="4" w:space="0" w:color="000000"/>
-              <w:right w:val="single" w:sz="4" w:space="0" w:color="000000"/>
-            </w:tcBorders>
-            <w:tcMar>
-              <w:top w:w="60" w:type="dxa"/>
-              <w:left w:w="80" w:type="dxa"/>
-              <w:bottom w:w="60" w:type="dxa"/>
-              <w:right w:w="80" w:type="dxa"/>
-            </w:tcMar>
-            <w:vAlign w:val="center"/>
-          </w:tcPr>
-          <w:p>
-            <w:pPr>
-              <w:spacing w:line="252" w:lineRule="auto"/>
-            </w:pPr>
-            <w:r>
-              <w:t>Song song: Tối ưu mô hình &amp; Chuẩn bị biên</w:t>
-            </w:r>
-          </w:p>
-        </w:tc>
-        <w:tc>
-          <w:tcPr>
-            <w:tcW w:w="3180" w:type="dxa"/>
-            <w:tcBorders>
-              <w:top w:val="single" w:sz="4" w:space="0" w:color="000000"/>
-              <w:left w:val="single" w:sz="4" w:space="0" w:color="000000"/>
-              <w:bottom w:val="single" w:sz="4" w:space="0" w:color="000000"/>
-              <w:right w:val="single" w:sz="4" w:space="0" w:color="000000"/>
-            </w:tcBorders>
-            <w:tcMar>
-              <w:top w:w="60" w:type="dxa"/>
-              <w:left w:w="80" w:type="dxa"/>
-              <w:bottom w:w="60" w:type="dxa"/>
-              <w:right w:w="80" w:type="dxa"/>
-            </w:tcMar>
-            <w:vAlign w:val="center"/>
-          </w:tcPr>
-          <w:p>
-            <w:pPr>
-              <w:spacing w:line="252" w:lineRule="auto"/>
-            </w:pPr>
-            <w:r>
-              <w:rPr>
-                <w:b/>
-                <w:bCs/>
-              </w:rPr>
-              <w:t>Nhật</w:t>
-            </w:r>
-            <w:r>
-              <w:t xml:space="preserve">: tối ưu và đóng gói mô hình (ONNX, quantization) theo hướng khả chuyển. </w:t>
-            </w:r>
-            <w:r>
-              <w:rPr>
-                <w:b/>
-                <w:bCs/>
-              </w:rPr>
-              <w:t>Đức</w:t>
-            </w:r>
-            <w:r>
-              <w:t xml:space="preserve">: cài đặt, cấu hình thiết bị biên và đóng gói hệ thống để triển khai. </w:t>
-            </w:r>
-            <w:r>
-              <w:br/>
-              <w:t>Viết phần báo cáo tương ứng.</w:t>
-            </w:r>
-          </w:p>
-        </w:tc>
-        <w:tc>
-          <w:tcPr>
-            <w:tcW w:w="1240" w:type="dxa"/>
-            <w:tcBorders>
-              <w:top w:val="single" w:sz="4" w:space="0" w:color="000000"/>
-              <w:left w:val="single" w:sz="4" w:space="0" w:color="000000"/>
-              <w:bottom w:val="single" w:sz="4" w:space="0" w:color="000000"/>
-              <w:right w:val="single" w:sz="4" w:space="0" w:color="000000"/>
-            </w:tcBorders>
-            <w:tcMar>
-              <w:top w:w="60" w:type="dxa"/>
-              <w:left w:w="80" w:type="dxa"/>
-              <w:bottom w:w="60" w:type="dxa"/>
-              <w:right w:w="80" w:type="dxa"/>
-            </w:tcMar>
-            <w:vAlign w:val="center"/>
-          </w:tcPr>
-          <w:p>
-            <w:pPr>
-              <w:spacing w:line="252" w:lineRule="auto"/>
-              <w:jc w:val="center"/>
-            </w:pPr>
-            <w:r>
-              <w:t>Cả 2</w:t>
-            </w:r>
-          </w:p>
-        </w:tc>
-        <w:tc>
-          <w:tcPr>
-            <w:tcW w:w="2000" w:type="dxa"/>
-            <w:tcBorders>
-              <w:top w:val="single" w:sz="4" w:space="0" w:color="000000"/>
-              <w:left w:val="single" w:sz="4" w:space="0" w:color="000000"/>
-              <w:bottom w:val="single" w:sz="4" w:space="0" w:color="000000"/>
-              <w:right w:val="single" w:sz="4" w:space="0" w:color="000000"/>
-            </w:tcBorders>
-            <w:tcMar>
-              <w:top w:w="60" w:type="dxa"/>
-              <w:left w:w="80" w:type="dxa"/>
-              <w:bottom w:w="60" w:type="dxa"/>
-              <w:right w:w="80" w:type="dxa"/>
-            </w:tcMar>
-            <w:vAlign w:val="center"/>
-          </w:tcPr>
-          <w:p>
-            <w:pPr>
-              <w:spacing w:line="252" w:lineRule="auto"/>
-            </w:pPr>
-            <w:r>
-              <w:t>Mô hình đã tối ưu, khả chuyển; thiết bị biên sẵn sàng.</w:t>
-            </w:r>
-          </w:p>
-        </w:tc>
-      </w:tr>
-      <w:tr>
-        <w:tc>
-          <w:tcPr>
-            <w:tcW w:w="1100" w:type="dxa"/>
-            <w:tcBorders>
-              <w:top w:val="single" w:sz="4" w:space="0" w:color="000000"/>
-              <w:left w:val="single" w:sz="4" w:space="0" w:color="000000"/>
-              <w:bottom w:val="single" w:sz="4" w:space="0" w:color="000000"/>
-              <w:right w:val="single" w:sz="4" w:space="0" w:color="000000"/>
-            </w:tcBorders>
-            <w:tcMar>
-              <w:top w:w="60" w:type="dxa"/>
-              <w:left w:w="40" w:type="dxa"/>
-              <w:bottom w:w="60" w:type="dxa"/>
-              <w:right w:w="40" w:type="dxa"/>
-            </w:tcMar>
-            <w:vAlign w:val="center"/>
-          </w:tcPr>
-          <w:p>
-            <w:pPr>
-              <w:spacing w:line="240" w:lineRule="auto"/>
-              <w:jc w:val="center"/>
-            </w:pPr>
-            <w:r>
-              <w:rPr>
-                <w:b/>
-                <w:bCs/>
-              </w:rPr>
-              <w:t>Tuần 8</w:t>
-            </w:r>
-          </w:p>
-          <w:p>
-            <w:pPr>
-              <w:spacing w:line="240" w:lineRule="auto"/>
-              <w:jc w:val="center"/>
-            </w:pPr>
-            <w:r>
-              <w:rPr>
-                <w:sz w:val="22"/>
-                <w:szCs w:val="22"/>
-              </w:rPr>
-              <w:t>02/09 - 09/09</w:t>
-            </w:r>
-          </w:p>
-        </w:tc>
-        <w:tc>
-          <w:tcPr>
-            <w:tcW w:w="1500" w:type="dxa"/>
-            <w:tcBorders>
-              <w:top w:val="single" w:sz="4" w:space="0" w:color="000000"/>
-              <w:left w:val="single" w:sz="4" w:space="0" w:color="000000"/>
-              <w:bottom w:val="single" w:sz="4" w:space="0" w:color="000000"/>
-              <w:right w:val="single" w:sz="4" w:space="0" w:color="000000"/>
-            </w:tcBorders>
-            <w:tcMar>
-              <w:top w:w="60" w:type="dxa"/>
-              <w:left w:w="80" w:type="dxa"/>
-              <w:bottom w:w="60" w:type="dxa"/>
-              <w:right w:w="80" w:type="dxa"/>
-            </w:tcMar>
-            <w:vAlign w:val="center"/>
-          </w:tcPr>
-          <w:p>
-            <w:pPr>
-              <w:spacing w:line="252" w:lineRule="auto"/>
-            </w:pPr>
-            <w:r>
-              <w:t>Triển khai thiết bị biên</w:t>
-            </w:r>
-          </w:p>
-        </w:tc>
-        <w:tc>
-          <w:tcPr>
-            <w:tcW w:w="3180" w:type="dxa"/>
-            <w:tcBorders>
-              <w:top w:val="single" w:sz="4" w:space="0" w:color="000000"/>
-              <w:left w:val="single" w:sz="4" w:space="0" w:color="000000"/>
-              <w:bottom w:val="single" w:sz="4" w:space="0" w:color="000000"/>
-              <w:right w:val="single" w:sz="4" w:space="0" w:color="000000"/>
-            </w:tcBorders>
-            <w:tcMar>
-              <w:top w:w="60" w:type="dxa"/>
-              <w:left w:w="80" w:type="dxa"/>
-              <w:bottom w:w="60" w:type="dxa"/>
-              <w:right w:w="80" w:type="dxa"/>
-            </w:tcMar>
-            <w:vAlign w:val="center"/>
-          </w:tcPr>
-          <w:p>
-            <w:pPr>
-              <w:spacing w:line="252" w:lineRule="auto"/>
-            </w:pPr>
-            <w:r>
-              <w:t xml:space="preserve">Triển khai toàn hệ thống lên thiết bị biên; chạy thử theo cơ chế xử lý từng lượt xe; sửa lỗi tích hợp. </w:t>
-            </w:r>
-            <w:r>
-              <w:br/>
-              <w:t>Viết phần báo cáo tương ứng.</w:t>
-            </w:r>
-          </w:p>
-        </w:tc>
-        <w:tc>
-          <w:tcPr>
-            <w:tcW w:w="1240" w:type="dxa"/>
-            <w:tcBorders>
-              <w:top w:val="single" w:sz="4" w:space="0" w:color="000000"/>
-              <w:left w:val="single" w:sz="4" w:space="0" w:color="000000"/>
-              <w:bottom w:val="single" w:sz="4" w:space="0" w:color="000000"/>
-              <w:right w:val="single" w:sz="4" w:space="0" w:color="000000"/>
-            </w:tcBorders>
-            <w:tcMar>
-              <w:top w:w="60" w:type="dxa"/>
-              <w:left w:w="80" w:type="dxa"/>
-              <w:bottom w:w="60" w:type="dxa"/>
-              <w:right w:w="80" w:type="dxa"/>
-            </w:tcMar>
-            <w:vAlign w:val="center"/>
-          </w:tcPr>
-          <w:p>
-            <w:pPr>
-              <w:spacing w:line="252" w:lineRule="auto"/>
-              <w:jc w:val="center"/>
-            </w:pPr>
-            <w:r>
-              <w:t>Cả 2</w:t>
-            </w:r>
-          </w:p>
-        </w:tc>
-        <w:tc>
-          <w:tcPr>
-            <w:tcW w:w="2000" w:type="dxa"/>
-            <w:tcBorders>
-              <w:top w:val="single" w:sz="4" w:space="0" w:color="000000"/>
-              <w:left w:val="single" w:sz="4" w:space="0" w:color="000000"/>
-              <w:bottom w:val="single" w:sz="4" w:space="0" w:color="000000"/>
-              <w:right w:val="single" w:sz="4" w:space="0" w:color="000000"/>
-            </w:tcBorders>
-            <w:tcMar>
-              <w:top w:w="60" w:type="dxa"/>
-              <w:left w:w="80" w:type="dxa"/>
-              <w:bottom w:w="60" w:type="dxa"/>
-              <w:right w:w="80" w:type="dxa"/>
-            </w:tcMar>
-            <w:vAlign w:val="center"/>
-          </w:tcPr>
-          <w:p>
-            <w:pPr>
-              <w:spacing w:line="252" w:lineRule="auto"/>
-            </w:pPr>
-            <w:r>
-              <w:t>Hệ thống chạy được trên thiết bị biên.</w:t>
-            </w:r>
-          </w:p>
-        </w:tc>
-      </w:tr>
-      <w:tr>
-        <w:tc>
-          <w:tcPr>
-            <w:tcW w:w="1100" w:type="dxa"/>
-            <w:tcBorders>
-              <w:top w:val="single" w:sz="4" w:space="0" w:color="000000"/>
-              <w:left w:val="single" w:sz="4" w:space="0" w:color="000000"/>
-              <w:bottom w:val="single" w:sz="4" w:space="0" w:color="000000"/>
-              <w:right w:val="single" w:sz="4" w:space="0" w:color="000000"/>
-            </w:tcBorders>
-            <w:tcMar>
-              <w:top w:w="60" w:type="dxa"/>
-              <w:left w:w="40" w:type="dxa"/>
-              <w:bottom w:w="60" w:type="dxa"/>
-              <w:right w:w="40" w:type="dxa"/>
-            </w:tcMar>
-            <w:vAlign w:val="center"/>
-          </w:tcPr>
-          <w:p>
-            <w:pPr>
-              <w:spacing w:line="240" w:lineRule="auto"/>
-              <w:jc w:val="center"/>
-            </w:pPr>
-            <w:r>
-              <w:rPr>
-                <w:b/>
-                <w:bCs/>
-              </w:rPr>
-              <w:t>Tuần 9</w:t>
-            </w:r>
-          </w:p>
-          <w:p>
-            <w:pPr>
-              <w:spacing w:line="240" w:lineRule="auto"/>
-              <w:jc w:val="center"/>
-            </w:pPr>
-            <w:r>
-              <w:rPr>
-                <w:sz w:val="22"/>
-                <w:szCs w:val="22"/>
-              </w:rPr>
-              <w:t>09/09 - 16/09</w:t>
-            </w:r>
-          </w:p>
-        </w:tc>
-        <w:tc>
-          <w:tcPr>
-            <w:tcW w:w="1500" w:type="dxa"/>
-            <w:tcBorders>
-              <w:top w:val="single" w:sz="4" w:space="0" w:color="000000"/>
-              <w:left w:val="single" w:sz="4" w:space="0" w:color="000000"/>
-              <w:bottom w:val="single" w:sz="4" w:space="0" w:color="000000"/>
-              <w:right w:val="single" w:sz="4" w:space="0" w:color="000000"/>
-            </w:tcBorders>
-            <w:tcMar>
-              <w:top w:w="60" w:type="dxa"/>
-              <w:left w:w="80" w:type="dxa"/>
-              <w:bottom w:w="60" w:type="dxa"/>
-              <w:right w:w="80" w:type="dxa"/>
-            </w:tcMar>
-            <w:vAlign w:val="center"/>
-          </w:tcPr>
-          <w:p>
-            <w:pPr>
-              <w:spacing w:line="252" w:lineRule="auto"/>
-            </w:pPr>
-            <w:r>
-              <w:t>Kiểm thử &amp; Đánh giá đa nền tảng</w:t>
-            </w:r>
-          </w:p>
-        </w:tc>
-        <w:tc>
-          <w:tcPr>
-            <w:tcW w:w="3180" w:type="dxa"/>
-            <w:tcBorders>
-              <w:top w:val="single" w:sz="4" w:space="0" w:color="000000"/>
-              <w:left w:val="single" w:sz="4" w:space="0" w:color="000000"/>
-              <w:bottom w:val="single" w:sz="4" w:space="0" w:color="000000"/>
-              <w:right w:val="single" w:sz="4" w:space="0" w:color="000000"/>
-            </w:tcBorders>
-            <w:tcMar>
-              <w:top w:w="60" w:type="dxa"/>
-              <w:left w:w="80" w:type="dxa"/>
-              <w:bottom w:w="60" w:type="dxa"/>
-              <w:right w:w="80" w:type="dxa"/>
-            </w:tcMar>
-            <w:vAlign w:val="center"/>
-          </w:tcPr>
-          <w:p>
-            <w:pPr>
-              <w:spacing w:line="252" w:lineRule="auto"/>
-            </w:pPr>
-            <w:r>
-              <w:t xml:space="preserve">Đo mAP, độ chính xác đọc biển, F1 loại xe, độ chính xác màu và tốc độ (PC so với thiết bị biên) theo từng </w:t>
-            </w:r>
-            <w:r>
-              <w:lastRenderedPageBreak/>
-              <w:t xml:space="preserve">điều kiện ánh sáng; sửa lỗi và tối ưu. </w:t>
-            </w:r>
-            <w:r>
-              <w:br/>
-              <w:t>Viết phần báo cáo tương ứng.</w:t>
-            </w:r>
-          </w:p>
-        </w:tc>
-        <w:tc>
-          <w:tcPr>
-            <w:tcW w:w="1240" w:type="dxa"/>
-            <w:tcBorders>
-              <w:top w:val="single" w:sz="4" w:space="0" w:color="000000"/>
-              <w:left w:val="single" w:sz="4" w:space="0" w:color="000000"/>
-              <w:bottom w:val="single" w:sz="4" w:space="0" w:color="000000"/>
-              <w:right w:val="single" w:sz="4" w:space="0" w:color="000000"/>
-            </w:tcBorders>
-            <w:tcMar>
-              <w:top w:w="60" w:type="dxa"/>
-              <w:left w:w="80" w:type="dxa"/>
-              <w:bottom w:w="60" w:type="dxa"/>
-              <w:right w:w="80" w:type="dxa"/>
-            </w:tcMar>
-            <w:vAlign w:val="center"/>
-          </w:tcPr>
-          <w:p>
-            <w:pPr>
-              <w:spacing w:line="252" w:lineRule="auto"/>
-              <w:jc w:val="center"/>
-            </w:pPr>
-            <w:r>
-              <w:lastRenderedPageBreak/>
-              <w:t>Cả 2</w:t>
-            </w:r>
-          </w:p>
-        </w:tc>
-        <w:tc>
-          <w:tcPr>
-            <w:tcW w:w="2000" w:type="dxa"/>
-            <w:tcBorders>
-              <w:top w:val="single" w:sz="4" w:space="0" w:color="000000"/>
-              <w:left w:val="single" w:sz="4" w:space="0" w:color="000000"/>
-              <w:bottom w:val="single" w:sz="4" w:space="0" w:color="000000"/>
-              <w:right w:val="single" w:sz="4" w:space="0" w:color="000000"/>
-            </w:tcBorders>
-            <w:tcMar>
-              <w:top w:w="60" w:type="dxa"/>
-              <w:left w:w="80" w:type="dxa"/>
-              <w:bottom w:w="60" w:type="dxa"/>
-              <w:right w:w="80" w:type="dxa"/>
-            </w:tcMar>
-            <w:vAlign w:val="center"/>
-          </w:tcPr>
-          <w:p>
-            <w:pPr>
-              <w:spacing w:line="252" w:lineRule="auto"/>
-            </w:pPr>
-            <w:r>
-              <w:t xml:space="preserve">Bảng số liệu đánh giá đầy đủ; bảng so sánh </w:t>
-            </w:r>
-            <w:r>
-              <w:lastRenderedPageBreak/>
-              <w:t>hiệu năng đa nền tảng.</w:t>
-            </w:r>
-          </w:p>
-        </w:tc>
-      </w:tr>
-      <w:tr>
-        <w:tc>
-          <w:tcPr>
-            <w:tcW w:w="1100" w:type="dxa"/>
-            <w:tcBorders>
-              <w:top w:val="single" w:sz="4" w:space="0" w:color="000000"/>
-              <w:left w:val="single" w:sz="4" w:space="0" w:color="000000"/>
-              <w:bottom w:val="single" w:sz="4" w:space="0" w:color="000000"/>
-              <w:right w:val="single" w:sz="4" w:space="0" w:color="000000"/>
-            </w:tcBorders>
-            <w:tcMar>
-              <w:top w:w="60" w:type="dxa"/>
-              <w:left w:w="40" w:type="dxa"/>
-              <w:bottom w:w="60" w:type="dxa"/>
-              <w:right w:w="40" w:type="dxa"/>
-            </w:tcMar>
-            <w:vAlign w:val="center"/>
-          </w:tcPr>
-          <w:p>
-            <w:pPr>
-              <w:spacing w:line="240" w:lineRule="auto"/>
-              <w:jc w:val="center"/>
-            </w:pPr>
-            <w:r>
-              <w:rPr>
-                <w:b/>
-                <w:bCs/>
-              </w:rPr>
-              <w:lastRenderedPageBreak/>
               <w:t>Tuần 10</w:t>
             </w:r>
           </w:p>
@@ -3966,7 +3987,6 @@
   <w:style w:type="character" w:default="1" w:styleId="DefaultParagraphFont">
     <w:name w:val="Default Paragraph Font"/>
     <w:uiPriority w:val="1"/>
-    <w:semiHidden/>
     <w:unhideWhenUsed/>
   </w:style>
   <w:style w:type="table" w:default="1" w:styleId="TableNormal">
@@ -4438,28 +4458,28 @@
 </file>
 
 <file path=customXml/item1.xml><?xml version="1.0" encoding="utf-8"?>
-<b:Sources xmlns:b="http://schemas.openxmlformats.org/officeDocument/2006/bibliography" xmlns="http://schemas.openxmlformats.org/officeDocument/2006/bibliography" SelectedStyle="\APASixthEditionOfficeOnline.xsl" StyleName="APA" Version="6"/>
-</file>
-
-<file path=customXml/item2.xml><?xml version="1.0" encoding="utf-8"?>
 <go:gDocsCustomXmlDataStorage xmlns:go="http://customooxmlschemas.google.com/" xmlns:r="http://schemas.openxmlformats.org/officeDocument/2006/relationships" uri="GoogleDocsCustomDataVersion2">
   <go:docsCustomData xmlns:go="http://customooxmlschemas.google.com/" roundtripDataSignature="AMtx7mhMt8f6IWcOFuqJHBZqMDEAMv58YA==">CgMxLjA4AHIhMWlscWNqLVJrdmFid0RNdHhtTXkyMzhUeUFha1luUmo4</go:docsCustomData>
 </go:gDocsCustomXmlDataStorage>
 </file>
 
-<file path=customXml/itemProps1.xml><?xml version="1.0" encoding="utf-8"?>
-<ds:datastoreItem xmlns:ds="http://schemas.openxmlformats.org/officeDocument/2006/customXml" ds:itemID="{8889C6CF-F721-4DB8-BB65-44A19FB9A764}">
-  <ds:schemaRefs>
-    <ds:schemaRef ds:uri="http://schemas.openxmlformats.org/officeDocument/2006/bibliography"/>
-  </ds:schemaRefs>
-</ds:datastoreItem>
+<file path=customXml/item2.xml><?xml version="1.0" encoding="utf-8"?>
+<b:Sources xmlns:b="http://schemas.openxmlformats.org/officeDocument/2006/bibliography" xmlns="http://schemas.openxmlformats.org/officeDocument/2006/bibliography" SelectedStyle="\APASixthEditionOfficeOnline.xsl" StyleName="APA" Version="6"/>
 </file>
 
-<file path=customXml/itemProps2.xml><?xml version="1.0" encoding="utf-8"?>
+<file path=customXml/itemProps1.xml><?xml version="1.0" encoding="utf-8"?>
 <ds:datastoreItem xmlns:ds="http://schemas.openxmlformats.org/officeDocument/2006/customXml" ds:itemID="{11111111-1234-1234-1234-123412341234}">
   <ds:schemaRefs>
     <ds:schemaRef ds:uri="http://customooxmlschemas.google.com/"/>
     <ds:schemaRef ds:uri="http://schemas.openxmlformats.org/officeDocument/2006/relationships"/>
   </ds:schemaRefs>
 </ds:datastoreItem>
+</file>
+
+<file path=customXml/itemProps2.xml><?xml version="1.0" encoding="utf-8"?>
+<ds:datastoreItem xmlns:ds="http://schemas.openxmlformats.org/officeDocument/2006/customXml" ds:itemID="{8889C6CF-F721-4DB8-BB65-44A19FB9A764}">
+  <ds:schemaRefs>
+    <ds:schemaRef ds:uri="http://schemas.openxmlformats.org/officeDocument/2006/bibliography"/>
+  </ds:schemaRefs>
+</ds:datastoreItem>
 </file>
</xml_diff>